<commit_message>
DAXSA: firma de la Gerente General insertada
Co-Authored-By: Claude Opus 5.5 <noreply@anthropic.com>
Claude-Session: https://claude.ai/code/session_01Ls5dNjYBLNjXxuGTDk7v3H
</commit_message>
<xml_diff>
--- a/carta-reclamo/daxsa/Carta_DAXSA_Confirmacion_Acreditacion.docx
+++ b/carta-reclamo/daxsa/Carta_DAXSA_Confirmacion_Acreditacion.docx
@@ -853,7 +853,7 @@
       </w:r>
     </w:p>
     <w:bookmarkEnd w:id="21"/>
-    <w:bookmarkStart w:id="31" w:name="lo-que-solicitamos"/>
+    <w:bookmarkStart w:id="34" w:name="lo-que-solicitamos"/>
     <w:p>
       <w:pPr>
         <w:pStyle w:val="Heading2"/>
@@ -1214,186 +1214,211 @@
         <w:pStyle w:val="BodyText"/>
       </w:pPr>
       <w:r>
-        <w:t xml:space="preserve"> </w:t>
-      </w:r>
-    </w:p>
-    <w:p>
-      <w:pPr>
-        <w:pStyle w:val="BodyText"/>
-      </w:pPr>
-      <w:r>
-        <w:t xml:space="preserve"> </w:t>
-      </w:r>
-    </w:p>
-    <w:p>
-      <w:pPr>
-        <w:pStyle w:val="BodyText"/>
-      </w:pPr>
-      <w:r>
-        <w:t xml:space="preserve">___________________________________</w:t>
-      </w:r>
-      <w:r>
-        <w:br/>
-      </w:r>
-      <w:r>
-        <w:rPr>
-          <w:bCs/>
-          <w:b/>
-        </w:rPr>
-        <w:t xml:space="preserve">DIANA AYDEE ARAUJO IZIQUE</w:t>
-      </w:r>
-      <w:r>
-        <w:br/>
-      </w:r>
-      <w:r>
-        <w:t xml:space="preserve">DNI N.° 40167540</w:t>
-      </w:r>
-      <w:r>
-        <w:br/>
-      </w:r>
-      <w:r>
-        <w:t xml:space="preserve">Gerente General</w:t>
-      </w:r>
-      <w:r>
-        <w:br/>
-      </w:r>
-      <w:r>
-        <w:rPr>
-          <w:bCs/>
-          <w:b/>
-        </w:rPr>
-        <w:t xml:space="preserve">IMPORTADORA DAXSA S.A.C.</w:t>
-      </w:r>
-      <w:r>
-        <w:t xml:space="preserve"> </w:t>
-      </w:r>
-      <w:r>
-        <w:t xml:space="preserve">– RUC N.° 20611290757</w:t>
-      </w:r>
-      <w:r>
-        <w:br/>
-      </w:r>
-      <w:r>
-        <w:t xml:space="preserve">Domicilio: El Ejército, Orrantia del Mar, Quinta Z 1180 – 0023, Magdalena del Mar, Lima</w:t>
-      </w:r>
-      <w:r>
-        <w:br/>
-      </w:r>
-      <w:r>
-        <w:t xml:space="preserve">Correo: licitaciones@forestalesdaxsa.com.pe / rsaldana64@gmail.com · Celular: 986045123</w:t>
-      </w:r>
-    </w:p>
-    <w:p>
-      <w:r>
-        <w:pict>
-          <v:rect style="width:0;height:1.5pt" o:hralign="center" o:hrstd="t" o:hr="t"/>
-        </w:pict>
-      </w:r>
-    </w:p>
-    <w:p>
-      <w:pPr>
-        <w:pStyle w:val="FirstParagraph"/>
-      </w:pPr>
-      <w:r>
-        <w:rPr>
-          <w:bCs/>
-          <w:b/>
-        </w:rPr>
-        <w:t xml:space="preserve">ANEXOS:</w:t>
-      </w:r>
-    </w:p>
-    <w:p>
-      <w:pPr>
-        <w:numPr>
-          <w:ilvl w:val="0"/>
-          <w:numId w:val="1003"/>
-        </w:numPr>
-        <w:pStyle w:val="Compact"/>
-      </w:pPr>
-      <w:r>
-        <w:rPr>
-          <w:bCs/>
-          <w:b/>
-        </w:rPr>
-        <w:t xml:space="preserve">Anexo 1:</w:t>
-      </w:r>
-      <w:r>
-        <w:t xml:space="preserve"> </w:t>
-      </w:r>
-      <w:r>
-        <w:t xml:space="preserve">Constancia del Registro N.° S-2024-31367 (subsanación del 20/11/2024).</w:t>
-      </w:r>
-    </w:p>
-    <w:p>
-      <w:pPr>
-        <w:numPr>
-          <w:ilvl w:val="0"/>
-          <w:numId w:val="1003"/>
-        </w:numPr>
-        <w:pStyle w:val="Compact"/>
-      </w:pPr>
-      <w:r>
-        <w:rPr>
-          <w:bCs/>
-          <w:b/>
-        </w:rPr>
-        <w:t xml:space="preserve">Anexo 2:</w:t>
-      </w:r>
-      <w:r>
-        <w:t xml:space="preserve"> </w:t>
-      </w:r>
-      <w:r>
-        <w:t xml:space="preserve">Carta N.° 06112024-03, del 06/11/2024 (solicitud de acreditación).</w:t>
-      </w:r>
-    </w:p>
-    <w:p>
-      <w:pPr>
-        <w:numPr>
-          <w:ilvl w:val="0"/>
-          <w:numId w:val="1003"/>
-        </w:numPr>
-        <w:pStyle w:val="Compact"/>
-      </w:pPr>
-      <w:r>
-        <w:rPr>
-          <w:bCs/>
-          <w:b/>
-        </w:rPr>
-        <w:t xml:space="preserve">Anexo 3:</w:t>
-      </w:r>
-      <w:r>
-        <w:t xml:space="preserve"> </w:t>
-      </w:r>
-      <w:r>
-        <w:t xml:space="preserve">Certificado de INDECOPI N.° 00302024 de la marca FD FORESTALES DAXSA.</w:t>
-      </w:r>
-    </w:p>
-    <w:p>
-      <w:r>
-        <w:br w:type="page"/>
-      </w:r>
-    </w:p>
-    <w:p>
-      <w:pPr>
-        <w:pStyle w:val="FirstParagraph"/>
-      </w:pPr>
-      <w:r>
         <w:drawing>
           <wp:inline>
-            <wp:extent cx="5334000" cy="4598275"/>
+            <wp:extent cx="1979999" cy="993852"/>
             <wp:effectExtent b="0" l="0" r="0" t="0"/>
             <wp:docPr descr="" title="" id="23" name="Picture"/>
             <a:graphic>
               <a:graphicData uri="http://schemas.openxmlformats.org/drawingml/2006/picture">
                 <pic:pic>
                   <pic:nvPicPr>
-                    <pic:cNvPr descr="anexos/registro_subsanacion.png" id="24" name="Picture"/>
+                    <pic:cNvPr descr="anexos/firma_diana.png" id="24" name="Picture"/>
                     <pic:cNvPicPr>
                       <a:picLocks noChangeArrowheads="1" noChangeAspect="1"/>
                     </pic:cNvPicPr>
                   </pic:nvPicPr>
                   <pic:blipFill>
                     <a:blip r:embed="rId22"/>
+                    <a:stretch>
+                      <a:fillRect/>
+                    </a:stretch>
+                  </pic:blipFill>
+                  <pic:spPr bwMode="auto">
+                    <a:xfrm>
+                      <a:off x="0" y="0"/>
+                      <a:ext cx="1979999" cy="993852"/>
+                    </a:xfrm>
+                    <a:prstGeom prst="rect">
+                      <a:avLst/>
+                    </a:prstGeom>
+                    <a:noFill/>
+                    <a:ln w="9525">
+                      <a:noFill/>
+                      <a:headEnd/>
+                      <a:tailEnd/>
+                    </a:ln>
+                  </pic:spPr>
+                </pic:pic>
+              </a:graphicData>
+            </a:graphic>
+          </wp:inline>
+        </w:drawing>
+      </w:r>
+    </w:p>
+    <w:p>
+      <w:pPr>
+        <w:pStyle w:val="BodyText"/>
+      </w:pPr>
+      <w:r>
+        <w:rPr>
+          <w:bCs/>
+          <w:b/>
+        </w:rPr>
+        <w:t xml:space="preserve">DIANA AYDEE ARAUJO IZIQUE</w:t>
+      </w:r>
+      <w:r>
+        <w:br/>
+      </w:r>
+      <w:r>
+        <w:t xml:space="preserve">DNI N.° 40167540</w:t>
+      </w:r>
+      <w:r>
+        <w:br/>
+      </w:r>
+      <w:r>
+        <w:t xml:space="preserve">Gerente General</w:t>
+      </w:r>
+      <w:r>
+        <w:br/>
+      </w:r>
+      <w:r>
+        <w:rPr>
+          <w:bCs/>
+          <w:b/>
+        </w:rPr>
+        <w:t xml:space="preserve">IMPORTADORA DAXSA S.A.C.</w:t>
+      </w:r>
+      <w:r>
+        <w:t xml:space="preserve"> </w:t>
+      </w:r>
+      <w:r>
+        <w:t xml:space="preserve">– RUC N.° 20611290757</w:t>
+      </w:r>
+      <w:r>
+        <w:br/>
+      </w:r>
+      <w:r>
+        <w:t xml:space="preserve">Domicilio: El Ejército, Orrantia del Mar, Quinta Z 1180 – 0023, Magdalena del Mar, Lima</w:t>
+      </w:r>
+      <w:r>
+        <w:br/>
+      </w:r>
+      <w:r>
+        <w:t xml:space="preserve">Correo: licitaciones@forestalesdaxsa.com.pe / rsaldana64@gmail.com · Celular: 986045123</w:t>
+      </w:r>
+    </w:p>
+    <w:p>
+      <w:r>
+        <w:pict>
+          <v:rect style="width:0;height:1.5pt" o:hralign="center" o:hrstd="t" o:hr="t"/>
+        </w:pict>
+      </w:r>
+    </w:p>
+    <w:p>
+      <w:pPr>
+        <w:pStyle w:val="FirstParagraph"/>
+      </w:pPr>
+      <w:r>
+        <w:rPr>
+          <w:bCs/>
+          <w:b/>
+        </w:rPr>
+        <w:t xml:space="preserve">ANEXOS:</w:t>
+      </w:r>
+    </w:p>
+    <w:p>
+      <w:pPr>
+        <w:numPr>
+          <w:ilvl w:val="0"/>
+          <w:numId w:val="1003"/>
+        </w:numPr>
+        <w:pStyle w:val="Compact"/>
+      </w:pPr>
+      <w:r>
+        <w:rPr>
+          <w:bCs/>
+          <w:b/>
+        </w:rPr>
+        <w:t xml:space="preserve">Anexo 1:</w:t>
+      </w:r>
+      <w:r>
+        <w:t xml:space="preserve"> </w:t>
+      </w:r>
+      <w:r>
+        <w:t xml:space="preserve">Constancia del Registro N.° S-2024-31367 (subsanación del 20/11/2024).</w:t>
+      </w:r>
+    </w:p>
+    <w:p>
+      <w:pPr>
+        <w:numPr>
+          <w:ilvl w:val="0"/>
+          <w:numId w:val="1003"/>
+        </w:numPr>
+        <w:pStyle w:val="Compact"/>
+      </w:pPr>
+      <w:r>
+        <w:rPr>
+          <w:bCs/>
+          <w:b/>
+        </w:rPr>
+        <w:t xml:space="preserve">Anexo 2:</w:t>
+      </w:r>
+      <w:r>
+        <w:t xml:space="preserve"> </w:t>
+      </w:r>
+      <w:r>
+        <w:t xml:space="preserve">Carta N.° 06112024-03, del 06/11/2024 (solicitud de acreditación).</w:t>
+      </w:r>
+    </w:p>
+    <w:p>
+      <w:pPr>
+        <w:numPr>
+          <w:ilvl w:val="0"/>
+          <w:numId w:val="1003"/>
+        </w:numPr>
+        <w:pStyle w:val="Compact"/>
+      </w:pPr>
+      <w:r>
+        <w:rPr>
+          <w:bCs/>
+          <w:b/>
+        </w:rPr>
+        <w:t xml:space="preserve">Anexo 3:</w:t>
+      </w:r>
+      <w:r>
+        <w:t xml:space="preserve"> </w:t>
+      </w:r>
+      <w:r>
+        <w:t xml:space="preserve">Certificado de INDECOPI N.° 00302024 de la marca FD FORESTALES DAXSA.</w:t>
+      </w:r>
+    </w:p>
+    <w:p>
+      <w:r>
+        <w:br w:type="page"/>
+      </w:r>
+    </w:p>
+    <w:p>
+      <w:pPr>
+        <w:pStyle w:val="FirstParagraph"/>
+      </w:pPr>
+      <w:r>
+        <w:drawing>
+          <wp:inline>
+            <wp:extent cx="5334000" cy="4598275"/>
+            <wp:effectExtent b="0" l="0" r="0" t="0"/>
+            <wp:docPr descr="" title="" id="26" name="Picture"/>
+            <a:graphic>
+              <a:graphicData uri="http://schemas.openxmlformats.org/drawingml/2006/picture">
+                <pic:pic>
+                  <pic:nvPicPr>
+                    <pic:cNvPr descr="anexos/registro_subsanacion.png" id="27" name="Picture"/>
+                    <pic:cNvPicPr>
+                      <a:picLocks noChangeArrowheads="1" noChangeAspect="1"/>
+                    </pic:cNvPicPr>
+                  </pic:nvPicPr>
+                  <pic:blipFill>
+                    <a:blip r:embed="rId25"/>
                     <a:stretch>
                       <a:fillRect/>
                     </a:stretch>
@@ -1446,76 +1471,12 @@
           <wp:inline>
             <wp:extent cx="4679999" cy="6618857"/>
             <wp:effectExtent b="0" l="0" r="0" t="0"/>
-            <wp:docPr descr="" title="" id="26" name="Picture"/>
-            <a:graphic>
-              <a:graphicData uri="http://schemas.openxmlformats.org/drawingml/2006/picture">
-                <pic:pic>
-                  <pic:nvPicPr>
-                    <pic:cNvPr descr="anexos/solicitud.png" id="27" name="Picture"/>
-                    <pic:cNvPicPr>
-                      <a:picLocks noChangeArrowheads="1" noChangeAspect="1"/>
-                    </pic:cNvPicPr>
-                  </pic:nvPicPr>
-                  <pic:blipFill>
-                    <a:blip r:embed="rId25"/>
-                    <a:stretch>
-                      <a:fillRect/>
-                    </a:stretch>
-                  </pic:blipFill>
-                  <pic:spPr bwMode="auto">
-                    <a:xfrm>
-                      <a:off x="0" y="0"/>
-                      <a:ext cx="4679999" cy="6618857"/>
-                    </a:xfrm>
-                    <a:prstGeom prst="rect">
-                      <a:avLst/>
-                    </a:prstGeom>
-                    <a:noFill/>
-                    <a:ln w="9525">
-                      <a:noFill/>
-                      <a:headEnd/>
-                      <a:tailEnd/>
-                    </a:ln>
-                  </pic:spPr>
-                </pic:pic>
-              </a:graphicData>
-            </a:graphic>
-          </wp:inline>
-        </w:drawing>
-      </w:r>
-    </w:p>
-    <w:p>
-      <w:pPr>
-        <w:pStyle w:val="BodyText"/>
-      </w:pPr>
-      <w:r>
-        <w:rPr>
-          <w:bCs/>
-          <w:b/>
-        </w:rPr>
-        <w:t xml:space="preserve">Anexo 2 – Carta N.° 06112024-03, del 06/11/2024: solicitud de acreditación de la marca FD FORESTALES DAXSA.</w:t>
-      </w:r>
-    </w:p>
-    <w:p>
-      <w:r>
-        <w:br w:type="page"/>
-      </w:r>
-    </w:p>
-    <w:p>
-      <w:pPr>
-        <w:pStyle w:val="BodyText"/>
-      </w:pPr>
-      <w:r>
-        <w:drawing>
-          <wp:inline>
-            <wp:extent cx="4679999" cy="6618857"/>
-            <wp:effectExtent b="0" l="0" r="0" t="0"/>
             <wp:docPr descr="" title="" id="29" name="Picture"/>
             <a:graphic>
               <a:graphicData uri="http://schemas.openxmlformats.org/drawingml/2006/picture">
                 <pic:pic>
                   <pic:nvPicPr>
-                    <pic:cNvPr descr="anexos/indecopi.png" id="30" name="Picture"/>
+                    <pic:cNvPr descr="anexos/solicitud.png" id="30" name="Picture"/>
                     <pic:cNvPicPr>
                       <a:picLocks noChangeArrowheads="1" noChangeAspect="1"/>
                     </pic:cNvPicPr>
@@ -1557,10 +1518,74 @@
           <w:bCs/>
           <w:b/>
         </w:rPr>
+        <w:t xml:space="preserve">Anexo 2 – Carta N.° 06112024-03, del 06/11/2024: solicitud de acreditación de la marca FD FORESTALES DAXSA.</w:t>
+      </w:r>
+    </w:p>
+    <w:p>
+      <w:r>
+        <w:br w:type="page"/>
+      </w:r>
+    </w:p>
+    <w:p>
+      <w:pPr>
+        <w:pStyle w:val="BodyText"/>
+      </w:pPr>
+      <w:r>
+        <w:drawing>
+          <wp:inline>
+            <wp:extent cx="4679999" cy="6618857"/>
+            <wp:effectExtent b="0" l="0" r="0" t="0"/>
+            <wp:docPr descr="" title="" id="32" name="Picture"/>
+            <a:graphic>
+              <a:graphicData uri="http://schemas.openxmlformats.org/drawingml/2006/picture">
+                <pic:pic>
+                  <pic:nvPicPr>
+                    <pic:cNvPr descr="anexos/indecopi.png" id="33" name="Picture"/>
+                    <pic:cNvPicPr>
+                      <a:picLocks noChangeArrowheads="1" noChangeAspect="1"/>
+                    </pic:cNvPicPr>
+                  </pic:nvPicPr>
+                  <pic:blipFill>
+                    <a:blip r:embed="rId31"/>
+                    <a:stretch>
+                      <a:fillRect/>
+                    </a:stretch>
+                  </pic:blipFill>
+                  <pic:spPr bwMode="auto">
+                    <a:xfrm>
+                      <a:off x="0" y="0"/>
+                      <a:ext cx="4679999" cy="6618857"/>
+                    </a:xfrm>
+                    <a:prstGeom prst="rect">
+                      <a:avLst/>
+                    </a:prstGeom>
+                    <a:noFill/>
+                    <a:ln w="9525">
+                      <a:noFill/>
+                      <a:headEnd/>
+                      <a:tailEnd/>
+                    </a:ln>
+                  </pic:spPr>
+                </pic:pic>
+              </a:graphicData>
+            </a:graphic>
+          </wp:inline>
+        </w:drawing>
+      </w:r>
+    </w:p>
+    <w:p>
+      <w:pPr>
+        <w:pStyle w:val="BodyText"/>
+      </w:pPr>
+      <w:r>
+        <w:rPr>
+          <w:bCs/>
+          <w:b/>
+        </w:rPr>
         <w:t xml:space="preserve">Anexo 3 – Certificado de INDECOPI N.° 00302024: marca FD FORESTALES DAXSA, Clase 19, vigente hasta el 28/12/2030.</w:t>
       </w:r>
     </w:p>
-    <w:bookmarkEnd w:id="31"/>
+    <w:bookmarkEnd w:id="34"/>
     <w:sectPr/>
   </w:body>
 </w:document>

</xml_diff>

<commit_message>
DAXSA: pedir copia de acreditación, vigencia y pasos para subir fichas
Co-Authored-By: Claude Opus 5.5 <noreply@anthropic.com>
Claude-Session: https://claude.ai/code/session_01Ls5dNjYBLNjXxuGTDk7v3H
</commit_message>
<xml_diff>
--- a/carta-reclamo/daxsa/Carta_DAXSA_Confirmacion_Acreditacion.docx
+++ b/carta-reclamo/daxsa/Carta_DAXSA_Confirmacion_Acreditacion.docx
@@ -89,7 +89,7 @@
         <w:t xml:space="preserve"> </w:t>
       </w:r>
       <w:r>
-        <w:t xml:space="preserve">SOLICITUD DE CONFIRMACIÓN DE ACREDITACIÓN COMO REPRESENTANTE DE LA MARCA</w:t>
+        <w:t xml:space="preserve">SOLICITUD DE COPIA DEL DOCUMENTO DE ACREDITACIÓN, CONFIRMACIÓN DE VIGENCIA E INDICACIONES PARA EL REGISTRO DE FICHAS-PRODUCTO de la marca</w:t>
       </w:r>
       <w:r>
         <w:t xml:space="preserve"> </w:t>
@@ -105,17 +105,17 @@
         <w:t xml:space="preserve"> </w:t>
       </w:r>
       <w:r>
-        <w:t xml:space="preserve">y de su</w:t>
-      </w:r>
-      <w:r>
-        <w:t xml:space="preserve"> </w:t>
-      </w:r>
-      <w:r>
-        <w:rPr>
-          <w:bCs/>
-          <w:b/>
-        </w:rPr>
-        <w:t xml:space="preserve">vigencia en el Acuerdo Marco actual EXT-CE-2024-16 – Accesorios Domésticos y Bienes para Usos Diversos</w:t>
+        <w:t xml:space="preserve">– Acuerdo Marco</w:t>
+      </w:r>
+      <w:r>
+        <w:t xml:space="preserve"> </w:t>
+      </w:r>
+      <w:r>
+        <w:rPr>
+          <w:bCs/>
+          <w:b/>
+        </w:rPr>
+        <w:t xml:space="preserve">EXT-CE-2024-16 – Accesorios Domésticos y Bienes para Usos Diversos</w:t>
       </w:r>
       <w:r>
         <w:t xml:space="preserve">.</w:t>
@@ -239,33 +239,49 @@
         <w:t xml:space="preserve">40167540</w:t>
       </w:r>
       <w:r>
-        <w:t xml:space="preserve">, se dirige a su Dirección para solicitar que se nos</w:t>
-      </w:r>
-      <w:r>
-        <w:t xml:space="preserve"> </w:t>
-      </w:r>
-      <w:r>
-        <w:rPr>
-          <w:bCs/>
-          <w:b/>
-        </w:rPr>
-        <w:t xml:space="preserve">confirme por escrito</w:t>
-      </w:r>
-      <w:r>
-        <w:t xml:space="preserve"> </w:t>
-      </w:r>
-      <w:r>
-        <w:t xml:space="preserve">nuestra acreditación como representante de marca y su</w:t>
-      </w:r>
-      <w:r>
-        <w:t xml:space="preserve"> </w:t>
-      </w:r>
-      <w:r>
-        <w:rPr>
-          <w:bCs/>
-          <w:b/>
-        </w:rPr>
-        <w:t xml:space="preserve">vigencia a la fecha</w:t>
+        <w:t xml:space="preserve">, se dirige a su Dirección para solicitar</w:t>
+      </w:r>
+      <w:r>
+        <w:t xml:space="preserve"> </w:t>
+      </w:r>
+      <w:r>
+        <w:rPr>
+          <w:bCs/>
+          <w:b/>
+        </w:rPr>
+        <w:t xml:space="preserve">copia del documento que nos acreditó</w:t>
+      </w:r>
+      <w:r>
+        <w:t xml:space="preserve"> </w:t>
+      </w:r>
+      <w:r>
+        <w:t xml:space="preserve">como representante de marca, la</w:t>
+      </w:r>
+      <w:r>
+        <w:t xml:space="preserve"> </w:t>
+      </w:r>
+      <w:r>
+        <w:rPr>
+          <w:bCs/>
+          <w:b/>
+        </w:rPr>
+        <w:t xml:space="preserve">confirmación de su vigencia</w:t>
+      </w:r>
+      <w:r>
+        <w:t xml:space="preserve"> </w:t>
+      </w:r>
+      <w:r>
+        <w:t xml:space="preserve">en el Acuerdo Marco actual y las</w:t>
+      </w:r>
+      <w:r>
+        <w:t xml:space="preserve"> </w:t>
+      </w:r>
+      <w:r>
+        <w:rPr>
+          <w:bCs/>
+          <w:b/>
+        </w:rPr>
+        <w:t xml:space="preserve">indicaciones para registrar nuestras fichas-producto</w:t>
       </w:r>
       <w:r>
         <w:t xml:space="preserve">.</w:t>
@@ -591,36 +607,100 @@
         <w:t xml:space="preserve"> </w:t>
       </w:r>
       <w:r>
-        <w:t xml:space="preserve">A la fecha</w:t>
-      </w:r>
-      <w:r>
-        <w:t xml:space="preserve"> </w:t>
-      </w:r>
-      <w:r>
-        <w:rPr>
-          <w:bCs/>
-          <w:b/>
-        </w:rPr>
-        <w:t xml:space="preserve">no tenemos certeza</w:t>
-      </w:r>
-      <w:r>
-        <w:t xml:space="preserve"> </w:t>
-      </w:r>
-      <w:r>
-        <w:t xml:space="preserve">sobre el resultado de nuestra solicitud ni sobre si nuestra acreditación</w:t>
-      </w:r>
-      <w:r>
-        <w:t xml:space="preserve"> </w:t>
-      </w:r>
-      <w:r>
-        <w:rPr>
-          <w:bCs/>
-          <w:b/>
-        </w:rPr>
-        <w:t xml:space="preserve">se mantiene vigente en el Acuerdo Marco actual EXT-CE-2024-16</w:t>
-      </w:r>
-      <w:r>
-        <w:t xml:space="preserve">. Necesitamos esa confirmación para gestionar correctamente nuestras fichas-producto y cumplir con nuestras obligaciones como representante de marca.</w:t>
+        <w:t xml:space="preserve">Entendemos que, tras la subsanación,</w:t>
+      </w:r>
+      <w:r>
+        <w:t xml:space="preserve"> </w:t>
+      </w:r>
+      <w:r>
+        <w:rPr>
+          <w:bCs/>
+          <w:b/>
+        </w:rPr>
+        <w:t xml:space="preserve">nuestra empresa fue acreditada</w:t>
+      </w:r>
+      <w:r>
+        <w:t xml:space="preserve"> </w:t>
+      </w:r>
+      <w:r>
+        <w:t xml:space="preserve">como representante de la marca. Sin embargo,</w:t>
+      </w:r>
+      <w:r>
+        <w:t xml:space="preserve"> </w:t>
+      </w:r>
+      <w:r>
+        <w:rPr>
+          <w:bCs/>
+          <w:b/>
+        </w:rPr>
+        <w:t xml:space="preserve">no conservamos la notificación</w:t>
+      </w:r>
+      <w:r>
+        <w:t xml:space="preserve"> </w:t>
+      </w:r>
+      <w:r>
+        <w:t xml:space="preserve">de acreditación remitida por correo electrónico, ni el</w:t>
+      </w:r>
+      <w:r>
+        <w:t xml:space="preserve"> </w:t>
+      </w:r>
+      <w:r>
+        <w:rPr>
+          <w:bCs/>
+          <w:b/>
+        </w:rPr>
+        <w:t xml:space="preserve">Formato o documento de acreditación</w:t>
+      </w:r>
+      <w:r>
+        <w:t xml:space="preserve"> </w:t>
+      </w:r>
+      <w:r>
+        <w:t xml:space="preserve">correspondiente, ni los datos de la</w:t>
+      </w:r>
+      <w:r>
+        <w:t xml:space="preserve"> </w:t>
+      </w:r>
+      <w:r>
+        <w:rPr>
+          <w:bCs/>
+          <w:b/>
+        </w:rPr>
+        <w:t xml:space="preserve">credencial de acceso</w:t>
+      </w:r>
+      <w:r>
+        <w:t xml:space="preserve"> </w:t>
+      </w:r>
+      <w:r>
+        <w:t xml:space="preserve">a la Plataforma. Necesitamos esa información para</w:t>
+      </w:r>
+      <w:r>
+        <w:t xml:space="preserve"> </w:t>
+      </w:r>
+      <w:r>
+        <w:rPr>
+          <w:bCs/>
+          <w:b/>
+        </w:rPr>
+        <w:t xml:space="preserve">registrar nuestras fichas-producto</w:t>
+      </w:r>
+      <w:r>
+        <w:t xml:space="preserve"> </w:t>
+      </w:r>
+      <w:r>
+        <w:t xml:space="preserve">en el Acuerdo Marco</w:t>
+      </w:r>
+      <w:r>
+        <w:t xml:space="preserve"> </w:t>
+      </w:r>
+      <w:r>
+        <w:rPr>
+          <w:bCs/>
+          <w:b/>
+        </w:rPr>
+        <w:t xml:space="preserve">EXT-CE-2024-16</w:t>
+      </w:r>
+      <w:r>
+        <w:t xml:space="preserve">, que es el actualmente vigente para nuestra categoría.</w:t>
       </w:r>
     </w:p>
     <w:bookmarkEnd w:id="20"/>
@@ -880,7 +960,7 @@
         <w:t xml:space="preserve">no mayor de diez (10) días hábiles</w:t>
       </w:r>
       <w:r>
-        <w:t xml:space="preserve">, su Dirección nos informe por escrito:</w:t>
+        <w:t xml:space="preserve">, su Dirección nos remita al correo electrónico consignado en la presente:</w:t>
       </w:r>
     </w:p>
     <w:p>
@@ -892,39 +972,17 @@
         <w:pStyle w:val="Compact"/>
       </w:pPr>
       <w:r>
-        <w:t xml:space="preserve">Si</w:t>
-      </w:r>
-      <w:r>
-        <w:t xml:space="preserve"> </w:t>
-      </w:r>
-      <w:r>
-        <w:rPr>
-          <w:bCs/>
-          <w:b/>
-        </w:rPr>
-        <w:t xml:space="preserve">IMPORTADORA DAXSA S.A.C.</w:t>
-      </w:r>
-      <w:r>
-        <w:t xml:space="preserve"> </w:t>
-      </w:r>
-      <w:r>
-        <w:t xml:space="preserve">fue</w:t>
-      </w:r>
-      <w:r>
-        <w:t xml:space="preserve"> </w:t>
-      </w:r>
-      <w:r>
-        <w:rPr>
-          <w:bCs/>
-          <w:b/>
-        </w:rPr>
-        <w:t xml:space="preserve">acreditada</w:t>
-      </w:r>
-      <w:r>
-        <w:t xml:space="preserve"> </w:t>
-      </w:r>
-      <w:r>
-        <w:t xml:space="preserve">como representante de la marca</w:t>
+        <w:rPr>
+          <w:bCs/>
+          <w:b/>
+        </w:rPr>
+        <w:t xml:space="preserve">Copia del Formato o documento de acreditación</w:t>
+      </w:r>
+      <w:r>
+        <w:t xml:space="preserve"> </w:t>
+      </w:r>
+      <w:r>
+        <w:t xml:space="preserve">de IMPORTADORA DAXSA S.A.C. como representante de la marca</w:t>
       </w:r>
       <w:r>
         <w:t xml:space="preserve"> </w:t>
@@ -937,20 +995,17 @@
         <w:t xml:space="preserve">FD FORESTALES DAXSA</w:t>
       </w:r>
       <w:r>
-        <w:t xml:space="preserve"> </w:t>
-      </w:r>
-      <w:r>
-        <w:t xml:space="preserve">a raíz de nuestra solicitud de 2024, indicando el</w:t>
-      </w:r>
-      <w:r>
-        <w:t xml:space="preserve"> </w:t>
-      </w:r>
-      <w:r>
-        <w:rPr>
-          <w:bCs/>
-          <w:b/>
-        </w:rPr>
-        <w:t xml:space="preserve">número y la fecha del Formato o documento de acreditación</w:t>
+        <w:t xml:space="preserve">, con su</w:t>
+      </w:r>
+      <w:r>
+        <w:t xml:space="preserve"> </w:t>
+      </w:r>
+      <w:r>
+        <w:rPr>
+          <w:bCs/>
+          <w:b/>
+        </w:rPr>
+        <w:t xml:space="preserve">número, fecha</w:t>
       </w:r>
       <w:r>
         <w:t xml:space="preserve"> </w:t>
@@ -984,17 +1039,33 @@
         <w:pStyle w:val="Compact"/>
       </w:pPr>
       <w:r>
-        <w:t xml:space="preserve">Si dicha acreditación</w:t>
-      </w:r>
-      <w:r>
-        <w:t xml:space="preserve"> </w:t>
-      </w:r>
-      <w:r>
-        <w:rPr>
-          <w:bCs/>
-          <w:b/>
-        </w:rPr>
-        <w:t xml:space="preserve">se mantiene vigente en el Acuerdo Marco actual EXT-CE-2024-16 – Accesorios Domésticos y Bienes para Usos Diversos</w:t>
+        <w:t xml:space="preserve">La</w:t>
+      </w:r>
+      <w:r>
+        <w:t xml:space="preserve"> </w:t>
+      </w:r>
+      <w:r>
+        <w:rPr>
+          <w:bCs/>
+          <w:b/>
+        </w:rPr>
+        <w:t xml:space="preserve">confirmación de que dicha acreditación se mantiene vigente</w:t>
+      </w:r>
+      <w:r>
+        <w:t xml:space="preserve"> </w:t>
+      </w:r>
+      <w:r>
+        <w:t xml:space="preserve">en el Acuerdo Marco</w:t>
+      </w:r>
+      <w:r>
+        <w:t xml:space="preserve"> </w:t>
+      </w:r>
+      <w:r>
+        <w:rPr>
+          <w:bCs/>
+          <w:b/>
+        </w:rPr>
+        <w:t xml:space="preserve">EXT-CE-2024-16 – Accesorios Domésticos y Bienes para Usos Diversos</w:t>
       </w:r>
       <w:r>
         <w:t xml:space="preserve">, y en qué</w:t>
@@ -1010,23 +1081,20 @@
         <w:t xml:space="preserve">catálogo(s) y categoría(s)</w:t>
       </w:r>
       <w:r>
-        <w:t xml:space="preserve">; o si existe alguna</w:t>
-      </w:r>
-      <w:r>
-        <w:t xml:space="preserve"> </w:t>
-      </w:r>
-      <w:r>
-        <w:rPr>
-          <w:bCs/>
-          <w:b/>
-        </w:rPr>
-        <w:t xml:space="preserve">suspensión, observación o requerimiento pendiente</w:t>
-      </w:r>
-      <w:r>
-        <w:t xml:space="preserve"> </w:t>
-      </w:r>
-      <w:r>
-        <w:t xml:space="preserve">que la afecte.</w:t>
+        <w:t xml:space="preserve">. Si para operar en este Acuerdo Marco corresponde una</w:t>
+      </w:r>
+      <w:r>
+        <w:t xml:space="preserve"> </w:t>
+      </w:r>
+      <w:r>
+        <w:rPr>
+          <w:bCs/>
+          <w:b/>
+        </w:rPr>
+        <w:t xml:space="preserve">nueva acreditación o una ampliación</w:t>
+      </w:r>
+      <w:r>
+        <w:t xml:space="preserve">, se nos indique el procedimiento.</w:t>
       </w:r>
     </w:p>
     <w:p>
@@ -1038,36 +1106,36 @@
         <w:pStyle w:val="Compact"/>
       </w:pPr>
       <w:r>
-        <w:t xml:space="preserve">Si, por el contrario, para operar en el Acuerdo Marco EXT-CE-2024-16 corresponde</w:t>
-      </w:r>
-      <w:r>
-        <w:t xml:space="preserve"> </w:t>
-      </w:r>
-      <w:r>
-        <w:rPr>
-          <w:bCs/>
-          <w:b/>
-        </w:rPr>
-        <w:t xml:space="preserve">solicitar una nueva acreditación o una ampliación</w:t>
-      </w:r>
-      <w:r>
-        <w:t xml:space="preserve">, se nos indique el</w:t>
-      </w:r>
-      <w:r>
-        <w:t xml:space="preserve"> </w:t>
-      </w:r>
-      <w:r>
-        <w:rPr>
-          <w:bCs/>
-          <w:b/>
-        </w:rPr>
-        <w:t xml:space="preserve">procedimiento y los plazos</w:t>
-      </w:r>
-      <w:r>
-        <w:t xml:space="preserve"> </w:t>
-      </w:r>
-      <w:r>
-        <w:t xml:space="preserve">para hacerlo.</w:t>
+        <w:t xml:space="preserve">Los</w:t>
+      </w:r>
+      <w:r>
+        <w:t xml:space="preserve"> </w:t>
+      </w:r>
+      <w:r>
+        <w:rPr>
+          <w:bCs/>
+          <w:b/>
+        </w:rPr>
+        <w:t xml:space="preserve">datos de nuestra credencial de acceso</w:t>
+      </w:r>
+      <w:r>
+        <w:t xml:space="preserve"> </w:t>
+      </w:r>
+      <w:r>
+        <w:t xml:space="preserve">(usuario) a la Plataforma de Catálogos Electrónicos y, de ser necesario, el procedimiento para</w:t>
+      </w:r>
+      <w:r>
+        <w:t xml:space="preserve"> </w:t>
+      </w:r>
+      <w:r>
+        <w:rPr>
+          <w:bCs/>
+          <w:b/>
+        </w:rPr>
+        <w:t xml:space="preserve">restablecer la contraseña</w:t>
+      </w:r>
+      <w:r>
+        <w:t xml:space="preserve">.</w:t>
       </w:r>
     </w:p>
     <w:p>
@@ -1079,23 +1147,81 @@
         <w:pStyle w:val="Compact"/>
       </w:pPr>
       <w:r>
-        <w:t xml:space="preserve">Si, como consecuencia del cambio de titularidad de la Dirección, corresponde</w:t>
-      </w:r>
-      <w:r>
-        <w:t xml:space="preserve"> </w:t>
-      </w:r>
-      <w:r>
-        <w:rPr>
-          <w:bCs/>
-          <w:b/>
-        </w:rPr>
-        <w:t xml:space="preserve">suscribir nuevamente el Acuerdo de Adhesión</w:t>
-      </w:r>
-      <w:r>
-        <w:t xml:space="preserve"> </w:t>
-      </w:r>
-      <w:r>
-        <w:t xml:space="preserve">o presentar documentación actualizada; de ser así, se nos remitan los formatos correspondientes.</w:t>
+        <w:t xml:space="preserve">Las</w:t>
+      </w:r>
+      <w:r>
+        <w:t xml:space="preserve"> </w:t>
+      </w:r>
+      <w:r>
+        <w:rPr>
+          <w:bCs/>
+          <w:b/>
+        </w:rPr>
+        <w:t xml:space="preserve">indicaciones para registrar nuestras fichas-producto</w:t>
+      </w:r>
+      <w:r>
+        <w:t xml:space="preserve">: el</w:t>
+      </w:r>
+      <w:r>
+        <w:t xml:space="preserve"> </w:t>
+      </w:r>
+      <w:r>
+        <w:rPr>
+          <w:bCs/>
+          <w:b/>
+        </w:rPr>
+        <w:t xml:space="preserve">procedimiento</w:t>
+      </w:r>
+      <w:r>
+        <w:t xml:space="preserve">, los</w:t>
+      </w:r>
+      <w:r>
+        <w:t xml:space="preserve"> </w:t>
+      </w:r>
+      <w:r>
+        <w:rPr>
+          <w:bCs/>
+          <w:b/>
+        </w:rPr>
+        <w:t xml:space="preserve">periodos habilitados</w:t>
+      </w:r>
+      <w:r>
+        <w:t xml:space="preserve"> </w:t>
+      </w:r>
+      <w:r>
+        <w:t xml:space="preserve">para la incorporación de fichas, los</w:t>
+      </w:r>
+      <w:r>
+        <w:t xml:space="preserve"> </w:t>
+      </w:r>
+      <w:r>
+        <w:rPr>
+          <w:bCs/>
+          <w:b/>
+        </w:rPr>
+        <w:t xml:space="preserve">requisitos y documentos</w:t>
+      </w:r>
+      <w:r>
+        <w:t xml:space="preserve"> </w:t>
+      </w:r>
+      <w:r>
+        <w:t xml:space="preserve">que debemos adjuntar, y los</w:t>
+      </w:r>
+      <w:r>
+        <w:t xml:space="preserve"> </w:t>
+      </w:r>
+      <w:r>
+        <w:rPr>
+          <w:bCs/>
+          <w:b/>
+        </w:rPr>
+        <w:t xml:space="preserve">manuales o guías</w:t>
+      </w:r>
+      <w:r>
+        <w:t xml:space="preserve"> </w:t>
+      </w:r>
+      <w:r>
+        <w:t xml:space="preserve">disponibles.</w:t>
       </w:r>
     </w:p>
     <w:p>
@@ -1107,90 +1233,23 @@
         <w:pStyle w:val="Compact"/>
       </w:pPr>
       <w:r>
-        <w:t xml:space="preserve">Si nuestra solicitud</w:t>
-      </w:r>
-      <w:r>
-        <w:t xml:space="preserve"> </w:t>
-      </w:r>
-      <w:r>
-        <w:rPr>
-          <w:bCs/>
-          <w:b/>
-        </w:rPr>
-        <w:t xml:space="preserve">no hubiera sido resuelta</w:t>
-      </w:r>
-      <w:r>
-        <w:t xml:space="preserve">, el</w:t>
-      </w:r>
-      <w:r>
-        <w:t xml:space="preserve"> </w:t>
-      </w:r>
-      <w:r>
-        <w:rPr>
-          <w:bCs/>
-          <w:b/>
-        </w:rPr>
-        <w:t xml:space="preserve">estado del trámite</w:t>
-      </w:r>
-      <w:r>
-        <w:t xml:space="preserve">, el área o funcionario a cargo y, de existir observaciones pendientes,</w:t>
-      </w:r>
-      <w:r>
-        <w:t xml:space="preserve"> </w:t>
-      </w:r>
-      <w:r>
-        <w:rPr>
-          <w:bCs/>
-          <w:b/>
-        </w:rPr>
-        <w:t xml:space="preserve">cuáles son</w:t>
-      </w:r>
-      <w:r>
-        <w:t xml:space="preserve">, para atenderlas de inmediato.</w:t>
-      </w:r>
-    </w:p>
-    <w:p>
-      <w:pPr>
-        <w:numPr>
-          <w:ilvl w:val="0"/>
-          <w:numId w:val="1002"/>
-        </w:numPr>
-        <w:pStyle w:val="Compact"/>
-      </w:pPr>
-      <w:r>
-        <w:t xml:space="preserve">Que se nos</w:t>
-      </w:r>
-      <w:r>
-        <w:t xml:space="preserve"> </w:t>
-      </w:r>
-      <w:r>
-        <w:rPr>
-          <w:bCs/>
-          <w:b/>
-        </w:rPr>
-        <w:t xml:space="preserve">remita copia</w:t>
-      </w:r>
-      <w:r>
-        <w:t xml:space="preserve"> </w:t>
-      </w:r>
-      <w:r>
-        <w:t xml:space="preserve">de la notificación de acreditación y de la</w:t>
-      </w:r>
-      <w:r>
-        <w:t xml:space="preserve"> </w:t>
-      </w:r>
-      <w:r>
-        <w:rPr>
-          <w:bCs/>
-          <w:b/>
-        </w:rPr>
-        <w:t xml:space="preserve">credencial de acceso</w:t>
-      </w:r>
-      <w:r>
-        <w:t xml:space="preserve"> </w:t>
-      </w:r>
-      <w:r>
-        <w:t xml:space="preserve">a la Plataforma, si ya fueron emitidas.</w:t>
+        <w:t xml:space="preserve">Si, como consecuencia del cambio de titularidad de la Dirección, corresponde</w:t>
+      </w:r>
+      <w:r>
+        <w:t xml:space="preserve"> </w:t>
+      </w:r>
+      <w:r>
+        <w:rPr>
+          <w:bCs/>
+          <w:b/>
+        </w:rPr>
+        <w:t xml:space="preserve">suscribir nuevamente el Acuerdo de Adhesión</w:t>
+      </w:r>
+      <w:r>
+        <w:t xml:space="preserve"> </w:t>
+      </w:r>
+      <w:r>
+        <w:t xml:space="preserve">o actualizar documentación; de ser así, se nos remitan los formatos correspondientes.</w:t>
       </w:r>
     </w:p>
     <w:p>

</xml_diff>

<commit_message>
DAXSA: párrafos justificados, solo correo de licitaciones, PDF foliado
Co-Authored-By: Claude Opus 5.5 <noreply@anthropic.com>
Claude-Session: https://claude.ai/code/session_01Ls5dNjYBLNjXxuGTDk7v3H
</commit_message>
<xml_diff>
--- a/carta-reclamo/daxsa/Carta_DAXSA_Confirmacion_Acreditacion.docx
+++ b/carta-reclamo/daxsa/Carta_DAXSA_Confirmacion_Acreditacion.docx
@@ -77,6 +77,7 @@
     <w:p>
       <w:pPr>
         <w:pStyle w:val="BodyText"/>
+        <w:jc w:val="both"/>
       </w:pPr>
       <w:r>
         <w:rPr>
@@ -140,6 +141,7 @@
           <w:numId w:val="1001"/>
         </w:numPr>
         <w:pStyle w:val="Compact"/>
+        <w:jc w:val="both"/>
       </w:pPr>
       <w:r>
         <w:t xml:space="preserve">Carta N.° 06112024-03, del 06 de noviembre de 2024: solicitud de acreditación como representante de la marca FD FORESTALES DAXSA.</w:t>
@@ -152,6 +154,7 @@
           <w:numId w:val="1001"/>
         </w:numPr>
         <w:pStyle w:val="Compact"/>
+        <w:jc w:val="both"/>
       </w:pPr>
       <w:r>
         <w:t xml:space="preserve">Carta N.° 20112024-05, del 20 de noviembre de 2024: subsanación de la solicitud –</w:t>
@@ -191,6 +194,7 @@
     <w:p>
       <w:pPr>
         <w:pStyle w:val="BodyText"/>
+        <w:jc w:val="both"/>
       </w:pPr>
       <w:r>
         <w:rPr>
@@ -299,6 +303,7 @@
     <w:p>
       <w:pPr>
         <w:pStyle w:val="FirstParagraph"/>
+        <w:jc w:val="both"/>
       </w:pPr>
       <w:r>
         <w:rPr>
@@ -429,6 +434,7 @@
     <w:p>
       <w:pPr>
         <w:pStyle w:val="BodyText"/>
+        <w:jc w:val="both"/>
       </w:pPr>
       <w:r>
         <w:t xml:space="preserve">Actualmente, los bienes de esta categoría se contratan a través del Acuerdo Marco</w:t>
@@ -450,6 +456,7 @@
     <w:p>
       <w:pPr>
         <w:pStyle w:val="BodyText"/>
+        <w:jc w:val="both"/>
       </w:pPr>
       <w:r>
         <w:rPr>
@@ -529,6 +536,7 @@
     <w:p>
       <w:pPr>
         <w:pStyle w:val="BodyText"/>
+        <w:jc w:val="both"/>
       </w:pPr>
       <w:r>
         <w:rPr>
@@ -595,6 +603,7 @@
     <w:p>
       <w:pPr>
         <w:pStyle w:val="BodyText"/>
+        <w:jc w:val="both"/>
       </w:pPr>
       <w:r>
         <w:rPr>
@@ -716,6 +725,7 @@
     <w:p>
       <w:pPr>
         <w:pStyle w:val="FirstParagraph"/>
+        <w:jc w:val="both"/>
       </w:pPr>
       <w:r>
         <w:rPr>
@@ -814,6 +824,7 @@
     <w:p>
       <w:pPr>
         <w:pStyle w:val="BodyText"/>
+        <w:jc w:val="both"/>
       </w:pPr>
       <w:r>
         <w:rPr>
@@ -875,6 +886,7 @@
     <w:p>
       <w:pPr>
         <w:pStyle w:val="BodyText"/>
+        <w:jc w:val="both"/>
       </w:pPr>
       <w:r>
         <w:rPr>
@@ -945,6 +957,7 @@
     <w:p>
       <w:pPr>
         <w:pStyle w:val="FirstParagraph"/>
+        <w:jc w:val="both"/>
       </w:pPr>
       <w:r>
         <w:t xml:space="preserve">Solicitamos que, en un plazo</w:t>
@@ -970,6 +983,7 @@
           <w:numId w:val="1002"/>
         </w:numPr>
         <w:pStyle w:val="Compact"/>
+        <w:jc w:val="both"/>
       </w:pPr>
       <w:r>
         <w:rPr>
@@ -1037,6 +1051,7 @@
           <w:numId w:val="1002"/>
         </w:numPr>
         <w:pStyle w:val="Compact"/>
+        <w:jc w:val="both"/>
       </w:pPr>
       <w:r>
         <w:t xml:space="preserve">La</w:t>
@@ -1104,6 +1119,7 @@
           <w:numId w:val="1002"/>
         </w:numPr>
         <w:pStyle w:val="Compact"/>
+        <w:jc w:val="both"/>
       </w:pPr>
       <w:r>
         <w:t xml:space="preserve">Los</w:t>
@@ -1145,6 +1161,7 @@
           <w:numId w:val="1002"/>
         </w:numPr>
         <w:pStyle w:val="Compact"/>
+        <w:jc w:val="both"/>
       </w:pPr>
       <w:r>
         <w:t xml:space="preserve">Las</w:t>
@@ -1231,6 +1248,7 @@
           <w:numId w:val="1002"/>
         </w:numPr>
         <w:pStyle w:val="Compact"/>
+        <w:jc w:val="both"/>
       </w:pPr>
       <w:r>
         <w:t xml:space="preserve">Si, como consecuencia del cambio de titularidad de la Dirección, corresponde</w:t>
@@ -1364,7 +1382,7 @@
         <w:br/>
       </w:r>
       <w:r>
-        <w:t xml:space="preserve">Correo: licitaciones@forestalesdaxsa.com.pe / rsaldana64@gmail.com · Celular: 986045123</w:t>
+        <w:t xml:space="preserve">Correo: licitaciones@forestalesdaxsa.com.pe · Celular: 986045123</w:t>
       </w:r>
     </w:p>
     <w:p>
@@ -1507,6 +1525,7 @@
     <w:p>
       <w:pPr>
         <w:pStyle w:val="BodyText"/>
+        <w:jc w:val="both"/>
       </w:pPr>
       <w:r>
         <w:rPr>
@@ -1571,6 +1590,7 @@
     <w:p>
       <w:pPr>
         <w:pStyle w:val="BodyText"/>
+        <w:jc w:val="both"/>
       </w:pPr>
       <w:r>
         <w:rPr>
@@ -1635,6 +1655,7 @@
     <w:p>
       <w:pPr>
         <w:pStyle w:val="BodyText"/>
+        <w:jc w:val="both"/>
       </w:pPr>
       <w:r>
         <w:rPr>

</xml_diff>